<commit_message>
Update DataEntry component UI and add GPS weekly upload data file
Replit-Commit-Author: Agent
</commit_message>
<xml_diff>
--- a/deliverables/GPS-Match-Upload-How-To.docx
+++ b/deliverables/GPS-Match-Upload-How-To.docx
@@ -51,27 +51,93 @@
           <w:sz w:val="22"/>
           <w:szCs w:val="22"/>
         </w:rPr>
-        <w:t xml:space="preserve">Data Entry → tab 6 · GPS. Catapult export straight into the app — no more Google Sheets middle step.</w:t>
+        <w:t xml:space="preserve">Data Entry → tab 6 · GPS. Your GPS file straight into the app — no more Google Sheets middle step.</w:t>
+      </w:r>
+    </w:p>
+    <w:p>
+      <w:pPr>
+        <w:spacing w:after="100"/>
+      </w:pPr>
+      <w:r>
+        <w:rPr>
+          <w:rFonts w:ascii="Calibri" w:cs="Calibri" w:eastAsia="Calibri" w:hAnsi="Calibri"/>
+          <w:color w:val="1C2B36"/>
+          <w:sz w:val="22"/>
+          <w:szCs w:val="22"/>
+        </w:rPr>
+        <w:t xml:space="preserve">The upload takes either file:</w:t>
+      </w:r>
+    </w:p>
+    <w:p>
+      <w:pPr>
+        <w:spacing w:after="100"/>
+        <w:ind w:left="288"/>
+      </w:pPr>
+      <w:r>
+        <w:rPr>
+          <w:rFonts w:ascii="Calibri" w:cs="Calibri" w:eastAsia="Calibri" w:hAnsi="Calibri"/>
+          <w:b/>
+          <w:bCs/>
+          <w:color w:val="1C2B36"/>
+          <w:sz w:val="22"/>
+          <w:szCs w:val="22"/>
+        </w:rPr>
+        <w:t xml:space="preserve">Your weekly sheet — </w:t>
+      </w:r>
+      <w:r>
+        <w:rPr>
+          <w:rFonts w:ascii="Calibri" w:cs="Calibri" w:eastAsia="Calibri" w:hAnsi="Calibri"/>
+          <w:color w:val="1C2B36"/>
+          <w:sz w:val="22"/>
+          <w:szCs w:val="22"/>
+        </w:rPr>
+        <w:t xml:space="preserve">the one with your own columns (Session Title, Round, Opponent, Date, Mins played). The app reads the match details straight from those columns, spots that both squads are in the one file, and saves each match separately in one go. No form-filling needed.</w:t>
       </w:r>
     </w:p>
     <w:p>
       <w:pPr>
         <w:spacing w:after="280"/>
-      </w:pPr>
-      <w:r>
-        <w:rPr>
-          <w:rFonts w:ascii="Calibri" w:cs="Calibri" w:eastAsia="Calibri" w:hAnsi="Calibri"/>
-          <w:color w:val="1C2B36"/>
-          <w:sz w:val="22"/>
-          <w:szCs w:val="22"/>
-        </w:rPr>
-        <w:t xml:space="preserve">Of the 109 columns in the Catapult export, the charts only actually use 29 — and the app finds every one of them by name, so the rest just get ignored. Drop the file in exactly as Catapult gives it to you.</w:t>
+        <w:ind w:left="288"/>
+      </w:pPr>
+      <w:r>
+        <w:rPr>
+          <w:rFonts w:ascii="Calibri" w:cs="Calibri" w:eastAsia="Calibri" w:hAnsi="Calibri"/>
+          <w:b/>
+          <w:bCs/>
+          <w:color w:val="1C2B36"/>
+          <w:sz w:val="22"/>
+          <w:szCs w:val="22"/>
+        </w:rPr>
+        <w:t xml:space="preserve">A raw Catapult export — </w:t>
+      </w:r>
+      <w:r>
+        <w:rPr>
+          <w:rFonts w:ascii="Calibri" w:cs="Calibri" w:eastAsia="Calibri" w:hAnsi="Calibri"/>
+          <w:color w:val="1C2B36"/>
+          <w:sz w:val="22"/>
+          <w:szCs w:val="22"/>
+        </w:rPr>
+        <w:t xml:space="preserve">no Round or Opponent columns in it, so a small form asks you for the date, round, squad and opponent instead.</w:t>
+      </w:r>
+    </w:p>
+    <w:p>
+      <w:pPr>
+        <w:spacing w:after="280"/>
+      </w:pPr>
+      <w:r>
+        <w:rPr>
+          <w:rFonts w:ascii="Calibri" w:cs="Calibri" w:eastAsia="Calibri" w:hAnsi="Calibri"/>
+          <w:color w:val="1C2B36"/>
+          <w:sz w:val="22"/>
+          <w:szCs w:val="22"/>
+        </w:rPr>
+        <w:t xml:space="preserve">Either way: of the 109 columns Catapult produces, the charts only use 29 — the app finds those by name and ignores the rest, including your Score, Formations, Conditions and Venue columns. Drop the file in exactly as it is.</w:t>
       </w:r>
     </w:p>
     <w:p>
       <w:pPr>
         <w:pStyle w:val="Heading1"/>
-        <w:spacing w:after="160"/>
+        <w:spacing w:after="160" w:before="120"/>
       </w:pPr>
       <w:r>
         <w:rPr>
@@ -82,7 +148,7 @@
           <w:sz w:val="30"/>
           <w:szCs w:val="30"/>
         </w:rPr>
-        <w:t xml:space="preserve">The five steps</w:t>
+        <w:t xml:space="preserve">The steps</w:t>
       </w:r>
     </w:p>
     <w:p>
@@ -103,16 +169,16 @@
           <w:sz w:val="22"/>
           <w:szCs w:val="22"/>
         </w:rPr>
-        <w:t xml:space="preserve">Fill in the match details</w:t>
-      </w:r>
-      <w:r>
-        <w:rPr>
-          <w:rFonts w:ascii="Calibri" w:cs="Calibri" w:eastAsia="Calibri" w:hAnsi="Calibri"/>
-          <w:color w:val="1C2B36"/>
-          <w:sz w:val="22"/>
-          <w:szCs w:val="22"/>
-        </w:rPr>
-        <w:t xml:space="preserve"> — date, round (e.g. R13 or GF), squad (1sts / Reserves / U18s / U17s) and opponent. These are the bits Catapult doesn't know — the same ones you type into your sheet today.</w:t>
+        <w:t xml:space="preserve">Drop in the file</w:t>
+      </w:r>
+      <w:r>
+        <w:rPr>
+          <w:rFonts w:ascii="Calibri" w:cs="Calibri" w:eastAsia="Calibri" w:hAnsi="Calibri"/>
+          <w:color w:val="1C2B36"/>
+          <w:sz w:val="22"/>
+          <w:szCs w:val="22"/>
+        </w:rPr>
+        <w:t xml:space="preserve"> (csv or xlsx) — weekly sheet or raw export, no tidying up needed.</w:t>
       </w:r>
     </w:p>
     <w:p>
@@ -133,16 +199,16 @@
           <w:sz w:val="22"/>
           <w:szCs w:val="22"/>
         </w:rPr>
-        <w:t xml:space="preserve">Drop in the CSV</w:t>
-      </w:r>
-      <w:r>
-        <w:rPr>
-          <w:rFonts w:ascii="Calibri" w:cs="Calibri" w:eastAsia="Calibri" w:hAnsi="Calibri"/>
-          <w:color w:val="1C2B36"/>
-          <w:sz w:val="22"/>
-          <w:szCs w:val="22"/>
-        </w:rPr>
-        <w:t xml:space="preserve"> exactly as Catapult gives it to you — no tidying up needed.</w:t>
+        <w:t xml:space="preserve">Check the match details</w:t>
+      </w:r>
+      <w:r>
+        <w:rPr>
+          <w:rFonts w:ascii="Calibri" w:cs="Calibri" w:eastAsia="Calibri" w:hAnsi="Calibri"/>
+          <w:color w:val="1C2B36"/>
+          <w:sz w:val="22"/>
+          <w:szCs w:val="22"/>
+        </w:rPr>
+        <w:t xml:space="preserve"> — with your weekly sheet they appear automatically (e.g. “R13-res v Majura (28/06/2026) · R13-1sts v Majura”). With a raw export, fill in the date, round (e.g. R13 or GF), squad and opponent.</w:t>
       </w:r>
     </w:p>
     <w:p>
@@ -193,16 +259,16 @@
           <w:sz w:val="22"/>
           <w:szCs w:val="22"/>
         </w:rPr>
-        <w:t xml:space="preserve">Minutes are pre-filled for you</w:t>
-      </w:r>
-      <w:r>
-        <w:rPr>
-          <w:rFonts w:ascii="Calibri" w:cs="Calibri" w:eastAsia="Calibri" w:hAnsi="Calibri"/>
-          <w:color w:val="1C2B36"/>
-          <w:sz w:val="22"/>
-          <w:szCs w:val="22"/>
-        </w:rPr>
-        <w:t xml:space="preserve"> — your “mins played” is the GPS duration converted to minutes, so the app does that sum itself. Each row is still editable in the preview if you ever want to override one.</w:t>
+        <w:t xml:space="preserve">Minutes are done for you</w:t>
+      </w:r>
+      <w:r>
+        <w:rPr>
+          <w:rFonts w:ascii="Calibri" w:cs="Calibri" w:eastAsia="Calibri" w:hAnsi="Calibri"/>
+          <w:color w:val="1C2B36"/>
+          <w:sz w:val="22"/>
+          <w:szCs w:val="22"/>
+        </w:rPr>
+        <w:t xml:space="preserve"> — your “mins played” formula (duration ÷ 60) is built in, and your weekly sheet's own Mins column is used when it's there. Each row is still editable in the preview if you ever want to override one.</w:t>
       </w:r>
     </w:p>
     <w:p>
@@ -232,13 +298,13 @@
           <w:sz w:val="22"/>
           <w:szCs w:val="22"/>
         </w:rPr>
-        <w:t xml:space="preserve"> — and like the testing upload, re-uploading a corrected file for the same round just replaces it cleanly.</w:t>
+        <w:t xml:space="preserve"> — one click saves every match in the file. Like the testing upload, re-uploading a corrected file for the same round just replaces it cleanly.</w:t>
       </w:r>
     </w:p>
     <w:p>
       <w:pPr>
         <w:pStyle w:val="Heading1"/>
-        <w:spacing w:after="160"/>
+        <w:spacing w:after="160" w:before="120"/>
       </w:pPr>
       <w:r>
         <w:rPr>

</xml_diff>